<commit_message>
Update PREPROYECTO DAW  ABRIL-JUNIO 2026 (1).docx
</commit_message>
<xml_diff>
--- a/PREPROYECTO DAW  ABRIL-JUNIO 2026 (1).docx
+++ b/PREPROYECTO DAW  ABRIL-JUNIO 2026 (1).docx
@@ -1965,6 +1965,7 @@
           <w:docPartUnique/>
         </w:docPartObj>
       </w:sdtPr>
+      <w:sdtEndPr/>
       <w:sdtContent>
         <w:p>
           <w:pPr>
@@ -3007,6 +3008,36 @@
     <w:p>
       <w:pPr>
         <w:pStyle w:val="normal1"/>
+        <w:ind w:left="1910" w:firstLine="0"/>
+        <w:rPr>
+          <w:lang w:val="en-US"/>
+        </w:rPr>
+      </w:pPr>
+    </w:p>
+    <w:p>
+      <w:pPr>
+        <w:pStyle w:val="normal1"/>
+      </w:pPr>
+      <w:r>
+        <w:t xml:space="preserve">BBDD: </w:t>
+      </w:r>
+    </w:p>
+    <w:p>
+      <w:pPr>
+        <w:pStyle w:val="normal1"/>
+        <w:numPr>
+          <w:ilvl w:val="0"/>
+          <w:numId w:val="10"/>
+        </w:numPr>
+      </w:pPr>
+      <w:r>
+        <w:t>MySQL</w:t>
+      </w:r>
+    </w:p>
+    <w:p>
+      <w:pPr>
+        <w:pStyle w:val="normal1"/>
+        <w:ind w:left="0" w:firstLine="0"/>
         <w:rPr>
           <w:lang w:val="en-US"/>
         </w:rPr>
@@ -3124,7 +3155,7 @@
         <w:pStyle w:val="normal1"/>
       </w:pPr>
       <w:r>
-        <w:t xml:space="preserve">BBDD: </w:t>
+        <w:t xml:space="preserve">Programas: </w:t>
       </w:r>
     </w:p>
     <w:p>
@@ -3135,33 +3166,16 @@
           <w:numId w:val="10"/>
         </w:numPr>
       </w:pPr>
-      <w:r>
-        <w:t>MySQL</w:t>
-      </w:r>
-    </w:p>
-    <w:p>
-      <w:pPr>
-        <w:pStyle w:val="normal1"/>
-      </w:pPr>
-    </w:p>
-    <w:p>
-      <w:pPr>
-        <w:pStyle w:val="normal1"/>
-      </w:pPr>
-      <w:r>
-        <w:t xml:space="preserve">Programas: </w:t>
-      </w:r>
-    </w:p>
-    <w:p>
-      <w:pPr>
-        <w:pStyle w:val="normal1"/>
-        <w:numPr>
-          <w:ilvl w:val="0"/>
-          <w:numId w:val="10"/>
-        </w:numPr>
-      </w:pPr>
-      <w:r>
-        <w:t xml:space="preserve">Visual Studio Code. </w:t>
+      <w:proofErr w:type="spellStart"/>
+      <w:r>
+        <w:t>Intelij</w:t>
+      </w:r>
+      <w:proofErr w:type="spellEnd"/>
+      <w:r>
+        <w:t xml:space="preserve"> IDEA</w:t>
+      </w:r>
+      <w:r>
+        <w:t xml:space="preserve"> </w:t>
       </w:r>
     </w:p>
     <w:p>
@@ -8387,6 +8401,7 @@
   <w:style w:type="character" w:default="1" w:styleId="Fuentedeprrafopredeter">
     <w:name w:val="Default Paragraph Font"/>
     <w:uiPriority w:val="1"/>
+    <w:semiHidden/>
     <w:unhideWhenUsed/>
   </w:style>
   <w:style w:type="table" w:default="1" w:styleId="Tablanormal">

</xml_diff>

<commit_message>
commit extra porque no iba
</commit_message>
<xml_diff>
--- a/PREPROYECTO DAW  ABRIL-JUNIO 2026 (1).docx
+++ b/PREPROYECTO DAW  ABRIL-JUNIO 2026 (1).docx
@@ -4119,14 +4119,7 @@
           <w:b/>
           <w:bCs/>
         </w:rPr>
-        <w:t>270</w:t>
-      </w:r>
-      <w:r>
-        <w:rPr>
-          <w:b/>
-          <w:bCs/>
-        </w:rPr>
-        <w:t>h</w:t>
+        <w:t>270h</w:t>
       </w:r>
       <w:r>
         <w:t xml:space="preserve"> y </w:t>
@@ -6414,6 +6407,9 @@
         </w:rPr>
       </w:pPr>
       <w:r>
+        <w:rPr>
+          <w:noProof/>
+        </w:rPr>
         <w:drawing>
           <wp:inline distT="0" distB="0" distL="0" distR="0" wp14:anchorId="2A316A09" wp14:editId="2728AEA2">
             <wp:extent cx="6299835" cy="3974465"/>
@@ -6526,6 +6522,9 @@
         </w:rPr>
       </w:pPr>
       <w:r>
+        <w:rPr>
+          <w:noProof/>
+        </w:rPr>
         <w:drawing>
           <wp:inline distT="0" distB="0" distL="0" distR="0" wp14:anchorId="35980DB9" wp14:editId="3FDD651D">
             <wp:extent cx="6299835" cy="2966085"/>
@@ -6604,6 +6603,9 @@
         </w:rPr>
       </w:pPr>
       <w:r>
+        <w:rPr>
+          <w:noProof/>
+        </w:rPr>
         <w:drawing>
           <wp:inline distT="0" distB="0" distL="0" distR="0" wp14:anchorId="68C63002" wp14:editId="0777CBE7">
             <wp:extent cx="6299835" cy="3265805"/>
@@ -6691,6 +6693,9 @@
         </w:rPr>
       </w:pPr>
       <w:r>
+        <w:rPr>
+          <w:noProof/>
+        </w:rPr>
         <w:drawing>
           <wp:inline distT="0" distB="0" distL="0" distR="0" wp14:anchorId="7520E690" wp14:editId="63FFC851">
             <wp:extent cx="6299835" cy="3344545"/>
@@ -6789,6 +6794,9 @@
         <w:ind w:hanging="1049"/>
       </w:pPr>
       <w:r>
+        <w:rPr>
+          <w:noProof/>
+        </w:rPr>
         <w:drawing>
           <wp:inline distT="0" distB="0" distL="0" distR="0" wp14:anchorId="1404F71F" wp14:editId="43E8936A">
             <wp:extent cx="6299835" cy="4137025"/>
@@ -6881,6 +6889,9 @@
         </w:rPr>
       </w:pPr>
       <w:r>
+        <w:rPr>
+          <w:noProof/>
+        </w:rPr>
         <w:drawing>
           <wp:inline distT="0" distB="0" distL="0" distR="0" wp14:anchorId="5527FB31" wp14:editId="3E726263">
             <wp:extent cx="6299835" cy="607695"/>
@@ -6966,6 +6977,9 @@
         </w:rPr>
       </w:pPr>
       <w:r>
+        <w:rPr>
+          <w:noProof/>
+        </w:rPr>
         <w:drawing>
           <wp:inline distT="0" distB="0" distL="0" distR="0" wp14:anchorId="72A0D66A" wp14:editId="7A6F4651">
             <wp:extent cx="6299835" cy="2984500"/>
@@ -7022,6 +7036,7 @@
         <w:rPr>
           <w:b/>
           <w:bCs/>
+          <w:noProof/>
         </w:rPr>
         <w:drawing>
           <wp:inline distT="0" distB="0" distL="0" distR="0" wp14:anchorId="321906A2" wp14:editId="464FB6C1">
@@ -7119,6 +7134,9 @@
         <w:ind w:hanging="1049"/>
       </w:pPr>
       <w:r>
+        <w:rPr>
+          <w:noProof/>
+        </w:rPr>
         <w:drawing>
           <wp:inline distT="0" distB="0" distL="0" distR="0" wp14:anchorId="6351DB29" wp14:editId="1107C877">
             <wp:extent cx="6299835" cy="3820795"/>
@@ -7233,6 +7251,9 @@
         </w:rPr>
       </w:pPr>
       <w:r>
+        <w:rPr>
+          <w:noProof/>
+        </w:rPr>
         <w:drawing>
           <wp:inline distT="0" distB="0" distL="0" distR="0" wp14:anchorId="267E8BAD" wp14:editId="3EB777CF">
             <wp:extent cx="6299835" cy="720090"/>
@@ -7282,6 +7303,9 @@
         <w:ind w:hanging="1191"/>
       </w:pPr>
       <w:r>
+        <w:rPr>
+          <w:noProof/>
+        </w:rPr>
         <w:drawing>
           <wp:inline distT="0" distB="0" distL="0" distR="0" wp14:anchorId="5FED83EE" wp14:editId="0CDE8C77">
             <wp:extent cx="6299835" cy="3642995"/>
@@ -7345,6 +7369,9 @@
         <w:ind w:hanging="1191"/>
       </w:pPr>
       <w:r>
+        <w:rPr>
+          <w:noProof/>
+        </w:rPr>
         <w:drawing>
           <wp:inline distT="0" distB="0" distL="0" distR="0" wp14:anchorId="39687E87" wp14:editId="1C6BEFDA">
             <wp:extent cx="6299835" cy="1316355"/>
@@ -7453,6 +7480,7 @@
       </w:r>
       <w:r>
         <w:rPr>
+          <w:noProof/>
           <w:sz w:val="28"/>
           <w:szCs w:val="28"/>
         </w:rPr>
@@ -7551,12 +7579,6 @@
         <w:gridCol w:w="4260"/>
       </w:tblGrid>
       <w:tr>
-        <w:tblPrEx>
-          <w:tblCellMar>
-            <w:top w:w="0" w:type="dxa"/>
-            <w:bottom w:w="0" w:type="dxa"/>
-          </w:tblCellMar>
-        </w:tblPrEx>
         <w:trPr>
           <w:tblHeader/>
         </w:trPr>
@@ -7743,12 +7765,6 @@
         </w:tc>
       </w:tr>
       <w:tr>
-        <w:tblPrEx>
-          <w:tblCellMar>
-            <w:top w:w="0" w:type="dxa"/>
-            <w:bottom w:w="0" w:type="dxa"/>
-          </w:tblCellMar>
-        </w:tblPrEx>
         <w:tc>
           <w:tcPr>
             <w:tcW w:w="800" w:type="dxa"/>
@@ -7933,12 +7949,6 @@
         </w:tc>
       </w:tr>
       <w:tr>
-        <w:tblPrEx>
-          <w:tblCellMar>
-            <w:top w:w="0" w:type="dxa"/>
-            <w:bottom w:w="0" w:type="dxa"/>
-          </w:tblCellMar>
-        </w:tblPrEx>
         <w:tc>
           <w:tcPr>
             <w:tcW w:w="800" w:type="dxa"/>
@@ -8116,12 +8126,6 @@
         </w:tc>
       </w:tr>
       <w:tr>
-        <w:tblPrEx>
-          <w:tblCellMar>
-            <w:top w:w="0" w:type="dxa"/>
-            <w:bottom w:w="0" w:type="dxa"/>
-          </w:tblCellMar>
-        </w:tblPrEx>
         <w:tc>
           <w:tcPr>
             <w:tcW w:w="800" w:type="dxa"/>
@@ -8292,12 +8296,6 @@
         </w:tc>
       </w:tr>
       <w:tr>
-        <w:tblPrEx>
-          <w:tblCellMar>
-            <w:top w:w="0" w:type="dxa"/>
-            <w:bottom w:w="0" w:type="dxa"/>
-          </w:tblCellMar>
-        </w:tblPrEx>
         <w:tc>
           <w:tcPr>
             <w:tcW w:w="800" w:type="dxa"/>
@@ -8493,12 +8491,6 @@
         </w:tc>
       </w:tr>
       <w:tr>
-        <w:tblPrEx>
-          <w:tblCellMar>
-            <w:top w:w="0" w:type="dxa"/>
-            <w:bottom w:w="0" w:type="dxa"/>
-          </w:tblCellMar>
-        </w:tblPrEx>
         <w:tc>
           <w:tcPr>
             <w:tcW w:w="800" w:type="dxa"/>
@@ -8669,12 +8661,6 @@
         </w:tc>
       </w:tr>
       <w:tr>
-        <w:tblPrEx>
-          <w:tblCellMar>
-            <w:top w:w="0" w:type="dxa"/>
-            <w:bottom w:w="0" w:type="dxa"/>
-          </w:tblCellMar>
-        </w:tblPrEx>
         <w:tc>
           <w:tcPr>
             <w:tcW w:w="800" w:type="dxa"/>
@@ -8877,12 +8863,6 @@
         </w:tc>
       </w:tr>
       <w:tr>
-        <w:tblPrEx>
-          <w:tblCellMar>
-            <w:top w:w="0" w:type="dxa"/>
-            <w:bottom w:w="0" w:type="dxa"/>
-          </w:tblCellMar>
-        </w:tblPrEx>
         <w:tc>
           <w:tcPr>
             <w:tcW w:w="800" w:type="dxa"/>
@@ -9069,12 +9049,6 @@
         </w:tc>
       </w:tr>
       <w:tr>
-        <w:tblPrEx>
-          <w:tblCellMar>
-            <w:top w:w="0" w:type="dxa"/>
-            <w:bottom w:w="0" w:type="dxa"/>
-          </w:tblCellMar>
-        </w:tblPrEx>
         <w:tc>
           <w:tcPr>
             <w:tcW w:w="800" w:type="dxa"/>
@@ -9270,12 +9244,6 @@
         </w:tc>
       </w:tr>
       <w:tr>
-        <w:tblPrEx>
-          <w:tblCellMar>
-            <w:top w:w="0" w:type="dxa"/>
-            <w:bottom w:w="0" w:type="dxa"/>
-          </w:tblCellMar>
-        </w:tblPrEx>
         <w:tc>
           <w:tcPr>
             <w:tcW w:w="800" w:type="dxa"/>
@@ -9471,12 +9439,6 @@
         </w:tc>
       </w:tr>
       <w:tr>
-        <w:tblPrEx>
-          <w:tblCellMar>
-            <w:top w:w="0" w:type="dxa"/>
-            <w:bottom w:w="0" w:type="dxa"/>
-          </w:tblCellMar>
-        </w:tblPrEx>
         <w:tc>
           <w:tcPr>
             <w:tcW w:w="800" w:type="dxa"/>
@@ -9672,12 +9634,6 @@
         </w:tc>
       </w:tr>
       <w:tr>
-        <w:tblPrEx>
-          <w:tblCellMar>
-            <w:top w:w="0" w:type="dxa"/>
-            <w:bottom w:w="0" w:type="dxa"/>
-          </w:tblCellMar>
-        </w:tblPrEx>
         <w:tc>
           <w:tcPr>
             <w:tcW w:w="800" w:type="dxa"/>
@@ -9848,12 +9804,6 @@
         </w:tc>
       </w:tr>
       <w:tr>
-        <w:tblPrEx>
-          <w:tblCellMar>
-            <w:top w:w="0" w:type="dxa"/>
-            <w:bottom w:w="0" w:type="dxa"/>
-          </w:tblCellMar>
-        </w:tblPrEx>
         <w:tc>
           <w:tcPr>
             <w:tcW w:w="800" w:type="dxa"/>
@@ -10024,12 +9974,6 @@
         </w:tc>
       </w:tr>
       <w:tr>
-        <w:tblPrEx>
-          <w:tblCellMar>
-            <w:top w:w="0" w:type="dxa"/>
-            <w:bottom w:w="0" w:type="dxa"/>
-          </w:tblCellMar>
-        </w:tblPrEx>
         <w:tc>
           <w:tcPr>
             <w:tcW w:w="800" w:type="dxa"/>
@@ -10207,12 +10151,6 @@
         </w:tc>
       </w:tr>
       <w:tr>
-        <w:tblPrEx>
-          <w:tblCellMar>
-            <w:top w:w="0" w:type="dxa"/>
-            <w:bottom w:w="0" w:type="dxa"/>
-          </w:tblCellMar>
-        </w:tblPrEx>
         <w:tc>
           <w:tcPr>
             <w:tcW w:w="800" w:type="dxa"/>
@@ -10391,12 +10329,6 @@
         </w:tc>
       </w:tr>
       <w:tr>
-        <w:tblPrEx>
-          <w:tblCellMar>
-            <w:top w:w="0" w:type="dxa"/>
-            <w:bottom w:w="0" w:type="dxa"/>
-          </w:tblCellMar>
-        </w:tblPrEx>
         <w:tc>
           <w:tcPr>
             <w:tcW w:w="800" w:type="dxa"/>
@@ -10592,12 +10524,6 @@
         </w:tc>
       </w:tr>
       <w:tr>
-        <w:tblPrEx>
-          <w:tblCellMar>
-            <w:top w:w="0" w:type="dxa"/>
-            <w:bottom w:w="0" w:type="dxa"/>
-          </w:tblCellMar>
-        </w:tblPrEx>
         <w:tc>
           <w:tcPr>
             <w:tcW w:w="800" w:type="dxa"/>
@@ -10777,12 +10703,6 @@
         </w:tc>
       </w:tr>
       <w:tr>
-        <w:tblPrEx>
-          <w:tblCellMar>
-            <w:top w:w="0" w:type="dxa"/>
-            <w:bottom w:w="0" w:type="dxa"/>
-          </w:tblCellMar>
-        </w:tblPrEx>
         <w:tc>
           <w:tcPr>
             <w:tcW w:w="800" w:type="dxa"/>
@@ -10953,12 +10873,6 @@
         </w:tc>
       </w:tr>
       <w:tr>
-        <w:tblPrEx>
-          <w:tblCellMar>
-            <w:top w:w="0" w:type="dxa"/>
-            <w:bottom w:w="0" w:type="dxa"/>
-          </w:tblCellMar>
-        </w:tblPrEx>
         <w:tc>
           <w:tcPr>
             <w:tcW w:w="800" w:type="dxa"/>
@@ -11138,12 +11052,6 @@
         </w:tc>
       </w:tr>
       <w:tr>
-        <w:tblPrEx>
-          <w:tblCellMar>
-            <w:top w:w="0" w:type="dxa"/>
-            <w:bottom w:w="0" w:type="dxa"/>
-          </w:tblCellMar>
-        </w:tblPrEx>
         <w:tc>
           <w:tcPr>
             <w:tcW w:w="800" w:type="dxa"/>
@@ -11321,12 +11229,6 @@
         </w:tc>
       </w:tr>
       <w:tr>
-        <w:tblPrEx>
-          <w:tblCellMar>
-            <w:top w:w="0" w:type="dxa"/>
-            <w:bottom w:w="0" w:type="dxa"/>
-          </w:tblCellMar>
-        </w:tblPrEx>
         <w:tc>
           <w:tcPr>
             <w:tcW w:w="800" w:type="dxa"/>
@@ -11495,12 +11397,6 @@
         </w:tc>
       </w:tr>
       <w:tr>
-        <w:tblPrEx>
-          <w:tblCellMar>
-            <w:top w:w="0" w:type="dxa"/>
-            <w:bottom w:w="0" w:type="dxa"/>
-          </w:tblCellMar>
-        </w:tblPrEx>
         <w:tc>
           <w:tcPr>
             <w:tcW w:w="800" w:type="dxa"/>
@@ -11696,12 +11592,6 @@
         </w:tc>
       </w:tr>
       <w:tr>
-        <w:tblPrEx>
-          <w:tblCellMar>
-            <w:top w:w="0" w:type="dxa"/>
-            <w:bottom w:w="0" w:type="dxa"/>
-          </w:tblCellMar>
-        </w:tblPrEx>
         <w:tc>
           <w:tcPr>
             <w:tcW w:w="800" w:type="dxa"/>
@@ -11870,12 +11760,6 @@
         </w:tc>
       </w:tr>
       <w:tr>
-        <w:tblPrEx>
-          <w:tblCellMar>
-            <w:top w:w="0" w:type="dxa"/>
-            <w:bottom w:w="0" w:type="dxa"/>
-          </w:tblCellMar>
-        </w:tblPrEx>
         <w:tc>
           <w:tcPr>
             <w:tcW w:w="800" w:type="dxa"/>
@@ -12044,12 +11928,6 @@
         </w:tc>
       </w:tr>
       <w:tr>
-        <w:tblPrEx>
-          <w:tblCellMar>
-            <w:top w:w="0" w:type="dxa"/>
-            <w:bottom w:w="0" w:type="dxa"/>
-          </w:tblCellMar>
-        </w:tblPrEx>
         <w:tc>
           <w:tcPr>
             <w:tcW w:w="800" w:type="dxa"/>
@@ -12227,12 +12105,6 @@
         </w:tc>
       </w:tr>
       <w:tr>
-        <w:tblPrEx>
-          <w:tblCellMar>
-            <w:top w:w="0" w:type="dxa"/>
-            <w:bottom w:w="0" w:type="dxa"/>
-          </w:tblCellMar>
-        </w:tblPrEx>
         <w:tc>
           <w:tcPr>
             <w:tcW w:w="800" w:type="dxa"/>
@@ -12410,12 +12282,6 @@
         </w:tc>
       </w:tr>
       <w:tr>
-        <w:tblPrEx>
-          <w:tblCellMar>
-            <w:top w:w="0" w:type="dxa"/>
-            <w:bottom w:w="0" w:type="dxa"/>
-          </w:tblCellMar>
-        </w:tblPrEx>
         <w:tc>
           <w:tcPr>
             <w:tcW w:w="800" w:type="dxa"/>
@@ -12593,12 +12459,6 @@
         </w:tc>
       </w:tr>
       <w:tr>
-        <w:tblPrEx>
-          <w:tblCellMar>
-            <w:top w:w="0" w:type="dxa"/>
-            <w:bottom w:w="0" w:type="dxa"/>
-          </w:tblCellMar>
-        </w:tblPrEx>
         <w:tc>
           <w:tcPr>
             <w:tcW w:w="800" w:type="dxa"/>
@@ -12776,12 +12636,6 @@
         </w:tc>
       </w:tr>
       <w:tr>
-        <w:tblPrEx>
-          <w:tblCellMar>
-            <w:top w:w="0" w:type="dxa"/>
-            <w:bottom w:w="0" w:type="dxa"/>
-          </w:tblCellMar>
-        </w:tblPrEx>
         <w:tc>
           <w:tcPr>
             <w:tcW w:w="800" w:type="dxa"/>
@@ -12959,12 +12813,6 @@
         </w:tc>
       </w:tr>
       <w:tr>
-        <w:tblPrEx>
-          <w:tblCellMar>
-            <w:top w:w="0" w:type="dxa"/>
-            <w:bottom w:w="0" w:type="dxa"/>
-          </w:tblCellMar>
-        </w:tblPrEx>
         <w:tc>
           <w:tcPr>
             <w:tcW w:w="800" w:type="dxa"/>
@@ -13151,12 +12999,6 @@
         </w:tc>
       </w:tr>
       <w:tr>
-        <w:tblPrEx>
-          <w:tblCellMar>
-            <w:top w:w="0" w:type="dxa"/>
-            <w:bottom w:w="0" w:type="dxa"/>
-          </w:tblCellMar>
-        </w:tblPrEx>
         <w:tc>
           <w:tcPr>
             <w:tcW w:w="800" w:type="dxa"/>
@@ -13343,12 +13185,6 @@
         </w:tc>
       </w:tr>
       <w:tr>
-        <w:tblPrEx>
-          <w:tblCellMar>
-            <w:top w:w="0" w:type="dxa"/>
-            <w:bottom w:w="0" w:type="dxa"/>
-          </w:tblCellMar>
-        </w:tblPrEx>
         <w:tc>
           <w:tcPr>
             <w:tcW w:w="800" w:type="dxa"/>
@@ -13535,12 +13371,6 @@
         </w:tc>
       </w:tr>
       <w:tr>
-        <w:tblPrEx>
-          <w:tblCellMar>
-            <w:top w:w="0" w:type="dxa"/>
-            <w:bottom w:w="0" w:type="dxa"/>
-          </w:tblCellMar>
-        </w:tblPrEx>
         <w:tc>
           <w:tcPr>
             <w:tcW w:w="800" w:type="dxa"/>
@@ -13727,12 +13557,6 @@
         </w:tc>
       </w:tr>
       <w:tr>
-        <w:tblPrEx>
-          <w:tblCellMar>
-            <w:top w:w="0" w:type="dxa"/>
-            <w:bottom w:w="0" w:type="dxa"/>
-          </w:tblCellMar>
-        </w:tblPrEx>
         <w:tc>
           <w:tcPr>
             <w:tcW w:w="800" w:type="dxa"/>
@@ -13910,12 +13734,6 @@
         </w:tc>
       </w:tr>
       <w:tr>
-        <w:tblPrEx>
-          <w:tblCellMar>
-            <w:top w:w="0" w:type="dxa"/>
-            <w:bottom w:w="0" w:type="dxa"/>
-          </w:tblCellMar>
-        </w:tblPrEx>
         <w:tc>
           <w:tcPr>
             <w:tcW w:w="800" w:type="dxa"/>
@@ -14102,12 +13920,6 @@
         </w:tc>
       </w:tr>
       <w:tr>
-        <w:tblPrEx>
-          <w:tblCellMar>
-            <w:top w:w="0" w:type="dxa"/>
-            <w:bottom w:w="0" w:type="dxa"/>
-          </w:tblCellMar>
-        </w:tblPrEx>
         <w:tc>
           <w:tcPr>
             <w:tcW w:w="800" w:type="dxa"/>
@@ -14287,12 +14099,6 @@
         </w:tc>
       </w:tr>
       <w:tr>
-        <w:tblPrEx>
-          <w:tblCellMar>
-            <w:top w:w="0" w:type="dxa"/>
-            <w:bottom w:w="0" w:type="dxa"/>
-          </w:tblCellMar>
-        </w:tblPrEx>
         <w:tc>
           <w:tcPr>
             <w:tcW w:w="800" w:type="dxa"/>
@@ -14479,12 +14285,6 @@
         </w:tc>
       </w:tr>
       <w:tr>
-        <w:tblPrEx>
-          <w:tblCellMar>
-            <w:top w:w="0" w:type="dxa"/>
-            <w:bottom w:w="0" w:type="dxa"/>
-          </w:tblCellMar>
-        </w:tblPrEx>
         <w:tc>
           <w:tcPr>
             <w:tcW w:w="800" w:type="dxa"/>
@@ -14664,12 +14464,6 @@
         </w:tc>
       </w:tr>
       <w:tr>
-        <w:tblPrEx>
-          <w:tblCellMar>
-            <w:top w:w="0" w:type="dxa"/>
-            <w:bottom w:w="0" w:type="dxa"/>
-          </w:tblCellMar>
-        </w:tblPrEx>
         <w:tc>
           <w:tcPr>
             <w:tcW w:w="800" w:type="dxa"/>
@@ -14856,12 +14650,6 @@
         </w:tc>
       </w:tr>
       <w:tr>
-        <w:tblPrEx>
-          <w:tblCellMar>
-            <w:top w:w="0" w:type="dxa"/>
-            <w:bottom w:w="0" w:type="dxa"/>
-          </w:tblCellMar>
-        </w:tblPrEx>
         <w:tc>
           <w:tcPr>
             <w:tcW w:w="800" w:type="dxa"/>
@@ -15039,12 +14827,6 @@
         </w:tc>
       </w:tr>
       <w:tr>
-        <w:tblPrEx>
-          <w:tblCellMar>
-            <w:top w:w="0" w:type="dxa"/>
-            <w:bottom w:w="0" w:type="dxa"/>
-          </w:tblCellMar>
-        </w:tblPrEx>
         <w:tc>
           <w:tcPr>
             <w:tcW w:w="800" w:type="dxa"/>
@@ -15233,12 +15015,6 @@
         </w:tc>
       </w:tr>
       <w:tr>
-        <w:tblPrEx>
-          <w:tblCellMar>
-            <w:top w:w="0" w:type="dxa"/>
-            <w:bottom w:w="0" w:type="dxa"/>
-          </w:tblCellMar>
-        </w:tblPrEx>
         <w:tc>
           <w:tcPr>
             <w:tcW w:w="800" w:type="dxa"/>
@@ -15416,12 +15192,6 @@
         </w:tc>
       </w:tr>
       <w:tr>
-        <w:tblPrEx>
-          <w:tblCellMar>
-            <w:top w:w="0" w:type="dxa"/>
-            <w:bottom w:w="0" w:type="dxa"/>
-          </w:tblCellMar>
-        </w:tblPrEx>
         <w:tc>
           <w:tcPr>
             <w:tcW w:w="800" w:type="dxa"/>
@@ -15599,12 +15369,6 @@
         </w:tc>
       </w:tr>
       <w:tr>
-        <w:tblPrEx>
-          <w:tblCellMar>
-            <w:top w:w="0" w:type="dxa"/>
-            <w:bottom w:w="0" w:type="dxa"/>
-          </w:tblCellMar>
-        </w:tblPrEx>
         <w:tc>
           <w:tcPr>
             <w:tcW w:w="800" w:type="dxa"/>
@@ -15791,12 +15555,6 @@
         </w:tc>
       </w:tr>
       <w:tr>
-        <w:tblPrEx>
-          <w:tblCellMar>
-            <w:top w:w="0" w:type="dxa"/>
-            <w:bottom w:w="0" w:type="dxa"/>
-          </w:tblCellMar>
-        </w:tblPrEx>
         <w:tc>
           <w:tcPr>
             <w:tcW w:w="800" w:type="dxa"/>
@@ -15994,12 +15752,6 @@
         </w:tc>
       </w:tr>
       <w:tr>
-        <w:tblPrEx>
-          <w:tblCellMar>
-            <w:top w:w="0" w:type="dxa"/>
-            <w:bottom w:w="0" w:type="dxa"/>
-          </w:tblCellMar>
-        </w:tblPrEx>
         <w:tc>
           <w:tcPr>
             <w:tcW w:w="800" w:type="dxa"/>
@@ -16197,12 +15949,6 @@
         </w:tc>
       </w:tr>
       <w:tr>
-        <w:tblPrEx>
-          <w:tblCellMar>
-            <w:top w:w="0" w:type="dxa"/>
-            <w:bottom w:w="0" w:type="dxa"/>
-          </w:tblCellMar>
-        </w:tblPrEx>
         <w:tc>
           <w:tcPr>
             <w:tcW w:w="800" w:type="dxa"/>
@@ -16389,12 +16135,6 @@
         </w:tc>
       </w:tr>
       <w:tr>
-        <w:tblPrEx>
-          <w:tblCellMar>
-            <w:top w:w="0" w:type="dxa"/>
-            <w:bottom w:w="0" w:type="dxa"/>
-          </w:tblCellMar>
-        </w:tblPrEx>
         <w:tc>
           <w:tcPr>
             <w:tcW w:w="800" w:type="dxa"/>
@@ -16582,12 +16322,6 @@
         </w:tc>
       </w:tr>
       <w:tr>
-        <w:tblPrEx>
-          <w:tblCellMar>
-            <w:top w:w="0" w:type="dxa"/>
-            <w:bottom w:w="0" w:type="dxa"/>
-          </w:tblCellMar>
-        </w:tblPrEx>
         <w:tc>
           <w:tcPr>
             <w:tcW w:w="800" w:type="dxa"/>
@@ -16776,12 +16510,6 @@
         </w:tc>
       </w:tr>
       <w:tr>
-        <w:tblPrEx>
-          <w:tblCellMar>
-            <w:top w:w="0" w:type="dxa"/>
-            <w:bottom w:w="0" w:type="dxa"/>
-          </w:tblCellMar>
-        </w:tblPrEx>
         <w:tc>
           <w:tcPr>
             <w:tcW w:w="800" w:type="dxa"/>
@@ -16970,12 +16698,6 @@
         </w:tc>
       </w:tr>
       <w:tr>
-        <w:tblPrEx>
-          <w:tblCellMar>
-            <w:top w:w="0" w:type="dxa"/>
-            <w:bottom w:w="0" w:type="dxa"/>
-          </w:tblCellMar>
-        </w:tblPrEx>
         <w:tc>
           <w:tcPr>
             <w:tcW w:w="800" w:type="dxa"/>
@@ -17164,12 +16886,6 @@
         </w:tc>
       </w:tr>
       <w:tr>
-        <w:tblPrEx>
-          <w:tblCellMar>
-            <w:top w:w="0" w:type="dxa"/>
-            <w:bottom w:w="0" w:type="dxa"/>
-          </w:tblCellMar>
-        </w:tblPrEx>
         <w:tc>
           <w:tcPr>
             <w:tcW w:w="800" w:type="dxa"/>
@@ -17347,12 +17063,6 @@
         </w:tc>
       </w:tr>
       <w:tr>
-        <w:tblPrEx>
-          <w:tblCellMar>
-            <w:top w:w="0" w:type="dxa"/>
-            <w:bottom w:w="0" w:type="dxa"/>
-          </w:tblCellMar>
-        </w:tblPrEx>
         <w:tc>
           <w:tcPr>
             <w:tcW w:w="800" w:type="dxa"/>
@@ -17541,12 +17251,6 @@
         </w:tc>
       </w:tr>
       <w:tr>
-        <w:tblPrEx>
-          <w:tblCellMar>
-            <w:top w:w="0" w:type="dxa"/>
-            <w:bottom w:w="0" w:type="dxa"/>
-          </w:tblCellMar>
-        </w:tblPrEx>
         <w:tc>
           <w:tcPr>
             <w:tcW w:w="800" w:type="dxa"/>
@@ -17735,12 +17439,6 @@
         </w:tc>
       </w:tr>
       <w:tr>
-        <w:tblPrEx>
-          <w:tblCellMar>
-            <w:top w:w="0" w:type="dxa"/>
-            <w:bottom w:w="0" w:type="dxa"/>
-          </w:tblCellMar>
-        </w:tblPrEx>
         <w:tc>
           <w:tcPr>
             <w:tcW w:w="800" w:type="dxa"/>
@@ -17929,12 +17627,6 @@
         </w:tc>
       </w:tr>
       <w:tr>
-        <w:tblPrEx>
-          <w:tblCellMar>
-            <w:top w:w="0" w:type="dxa"/>
-            <w:bottom w:w="0" w:type="dxa"/>
-          </w:tblCellMar>
-        </w:tblPrEx>
         <w:tc>
           <w:tcPr>
             <w:tcW w:w="800" w:type="dxa"/>
@@ -18123,12 +17815,6 @@
         </w:tc>
       </w:tr>
       <w:tr>
-        <w:tblPrEx>
-          <w:tblCellMar>
-            <w:top w:w="0" w:type="dxa"/>
-            <w:bottom w:w="0" w:type="dxa"/>
-          </w:tblCellMar>
-        </w:tblPrEx>
         <w:tc>
           <w:tcPr>
             <w:tcW w:w="800" w:type="dxa"/>
@@ -18315,12 +18001,6 @@
         </w:tc>
       </w:tr>
       <w:tr>
-        <w:tblPrEx>
-          <w:tblCellMar>
-            <w:top w:w="0" w:type="dxa"/>
-            <w:bottom w:w="0" w:type="dxa"/>
-          </w:tblCellMar>
-        </w:tblPrEx>
         <w:tc>
           <w:tcPr>
             <w:tcW w:w="800" w:type="dxa"/>
@@ -18498,12 +18178,6 @@
         </w:tc>
       </w:tr>
       <w:tr>
-        <w:tblPrEx>
-          <w:tblCellMar>
-            <w:top w:w="0" w:type="dxa"/>
-            <w:bottom w:w="0" w:type="dxa"/>
-          </w:tblCellMar>
-        </w:tblPrEx>
         <w:tc>
           <w:tcPr>
             <w:tcW w:w="800" w:type="dxa"/>
@@ -18681,12 +18355,6 @@
         </w:tc>
       </w:tr>
       <w:tr>
-        <w:tblPrEx>
-          <w:tblCellMar>
-            <w:top w:w="0" w:type="dxa"/>
-            <w:bottom w:w="0" w:type="dxa"/>
-          </w:tblCellMar>
-        </w:tblPrEx>
         <w:tc>
           <w:tcPr>
             <w:tcW w:w="800" w:type="dxa"/>
@@ -18866,12 +18534,6 @@
         </w:tc>
       </w:tr>
       <w:tr>
-        <w:tblPrEx>
-          <w:tblCellMar>
-            <w:top w:w="0" w:type="dxa"/>
-            <w:bottom w:w="0" w:type="dxa"/>
-          </w:tblCellMar>
-        </w:tblPrEx>
         <w:tc>
           <w:tcPr>
             <w:tcW w:w="800" w:type="dxa"/>
@@ -19051,12 +18713,6 @@
         </w:tc>
       </w:tr>
       <w:tr>
-        <w:tblPrEx>
-          <w:tblCellMar>
-            <w:top w:w="0" w:type="dxa"/>
-            <w:bottom w:w="0" w:type="dxa"/>
-          </w:tblCellMar>
-        </w:tblPrEx>
         <w:tc>
           <w:tcPr>
             <w:tcW w:w="800" w:type="dxa"/>
@@ -19245,12 +18901,6 @@
         </w:tc>
       </w:tr>
       <w:tr>
-        <w:tblPrEx>
-          <w:tblCellMar>
-            <w:top w:w="0" w:type="dxa"/>
-            <w:bottom w:w="0" w:type="dxa"/>
-          </w:tblCellMar>
-        </w:tblPrEx>
         <w:tc>
           <w:tcPr>
             <w:tcW w:w="800" w:type="dxa"/>
@@ -19439,12 +19089,6 @@
         </w:tc>
       </w:tr>
       <w:tr>
-        <w:tblPrEx>
-          <w:tblCellMar>
-            <w:top w:w="0" w:type="dxa"/>
-            <w:bottom w:w="0" w:type="dxa"/>
-          </w:tblCellMar>
-        </w:tblPrEx>
         <w:tc>
           <w:tcPr>
             <w:tcW w:w="800" w:type="dxa"/>
@@ -19640,12 +19284,6 @@
         </w:tc>
       </w:tr>
       <w:tr>
-        <w:tblPrEx>
-          <w:tblCellMar>
-            <w:top w:w="0" w:type="dxa"/>
-            <w:bottom w:w="0" w:type="dxa"/>
-          </w:tblCellMar>
-        </w:tblPrEx>
         <w:tc>
           <w:tcPr>
             <w:tcW w:w="800" w:type="dxa"/>
@@ -19825,12 +19463,6 @@
         </w:tc>
       </w:tr>
       <w:tr>
-        <w:tblPrEx>
-          <w:tblCellMar>
-            <w:top w:w="0" w:type="dxa"/>
-            <w:bottom w:w="0" w:type="dxa"/>
-          </w:tblCellMar>
-        </w:tblPrEx>
         <w:tc>
           <w:tcPr>
             <w:tcW w:w="800" w:type="dxa"/>
@@ -20017,12 +19649,6 @@
         </w:tc>
       </w:tr>
       <w:tr>
-        <w:tblPrEx>
-          <w:tblCellMar>
-            <w:top w:w="0" w:type="dxa"/>
-            <w:bottom w:w="0" w:type="dxa"/>
-          </w:tblCellMar>
-        </w:tblPrEx>
         <w:tc>
           <w:tcPr>
             <w:tcW w:w="800" w:type="dxa"/>
@@ -20209,12 +19835,6 @@
         </w:tc>
       </w:tr>
       <w:tr>
-        <w:tblPrEx>
-          <w:tblCellMar>
-            <w:top w:w="0" w:type="dxa"/>
-            <w:bottom w:w="0" w:type="dxa"/>
-          </w:tblCellMar>
-        </w:tblPrEx>
         <w:tc>
           <w:tcPr>
             <w:tcW w:w="800" w:type="dxa"/>
@@ -20401,12 +20021,6 @@
         </w:tc>
       </w:tr>
       <w:tr>
-        <w:tblPrEx>
-          <w:tblCellMar>
-            <w:top w:w="0" w:type="dxa"/>
-            <w:bottom w:w="0" w:type="dxa"/>
-          </w:tblCellMar>
-        </w:tblPrEx>
         <w:tc>
           <w:tcPr>
             <w:tcW w:w="800" w:type="dxa"/>
@@ -20570,6 +20184,18 @@
           <w:sz w:val="14"/>
           <w:szCs w:val="14"/>
         </w:rPr>
+      </w:pPr>
+    </w:p>
+    <w:p>
+      <w:pPr>
+        <w:pStyle w:val="normal1"/>
+        <w:ind w:left="-426" w:firstLine="426"/>
+      </w:pPr>
+    </w:p>
+    <w:p>
+      <w:pPr>
+        <w:pStyle w:val="normal1"/>
+        <w:ind w:left="-426" w:firstLine="426"/>
       </w:pPr>
     </w:p>
     <w:p>
@@ -21146,21 +20772,11 @@
           <w:r>
             <w:t xml:space="preserve"> | </w:t>
           </w:r>
-          <w:r>
-            <w:fldChar w:fldCharType="begin"/>
-          </w:r>
-          <w:r>
-            <w:instrText xml:space="preserve"> NUMPAGES </w:instrText>
-          </w:r>
-          <w:r>
-            <w:fldChar w:fldCharType="separate"/>
-          </w:r>
-          <w:r>
-            <w:t>4</w:t>
-          </w:r>
-          <w:r>
-            <w:fldChar w:fldCharType="end"/>
-          </w:r>
+          <w:fldSimple w:instr=" NUMPAGES ">
+            <w:r>
+              <w:t>4</w:t>
+            </w:r>
+          </w:fldSimple>
         </w:p>
       </w:tc>
     </w:tr>
@@ -21792,21 +21408,11 @@
           <w:r>
             <w:t xml:space="preserve"> | </w:t>
           </w:r>
-          <w:r>
-            <w:fldChar w:fldCharType="begin"/>
-          </w:r>
-          <w:r>
-            <w:instrText xml:space="preserve"> NUMPAGES </w:instrText>
-          </w:r>
-          <w:r>
-            <w:fldChar w:fldCharType="separate"/>
-          </w:r>
-          <w:r>
-            <w:t>4</w:t>
-          </w:r>
-          <w:r>
-            <w:fldChar w:fldCharType="end"/>
-          </w:r>
+          <w:fldSimple w:instr=" NUMPAGES ">
+            <w:r>
+              <w:t>4</w:t>
+            </w:r>
+          </w:fldSimple>
         </w:p>
       </w:tc>
     </w:tr>
@@ -26976,6 +26582,7 @@
   <w:style w:type="character" w:default="1" w:styleId="Fuentedeprrafopredeter">
     <w:name w:val="Default Paragraph Font"/>
     <w:uiPriority w:val="1"/>
+    <w:semiHidden/>
     <w:unhideWhenUsed/>
   </w:style>
   <w:style w:type="table" w:default="1" w:styleId="Tablanormal">

</xml_diff>

<commit_message>
pdf proyecto, listo entrega final.
</commit_message>
<xml_diff>
--- a/PREPROYECTO DAW  ABRIL-JUNIO 2026 (1).docx
+++ b/PREPROYECTO DAW  ABRIL-JUNIO 2026 (1).docx
@@ -2696,15 +2696,7 @@
         <w:pStyle w:val="normal1"/>
       </w:pPr>
       <w:r>
-        <w:t>La vista de inicio mostrará información relativa a la librería, localización, logo, opciones de contacto</w:t>
-      </w:r>
-      <w:proofErr w:type="gramStart"/>
-      <w:r>
-        <w:t>… ,</w:t>
-      </w:r>
-      <w:proofErr w:type="gramEnd"/>
-      <w:r>
-        <w:t xml:space="preserve"> y los últimos 5 títulos añadidos además de un acceso a una vista de búsqueda y a la vista de administración protegida.</w:t>
+        <w:t>La vista de inicio mostrará información relativa a la librería, localización, logo, opciones de contacto… , y los últimos 5 títulos añadidos además de un acceso a una vista de búsqueda y a la vista de administración protegida.</w:t>
       </w:r>
     </w:p>
     <w:p>
@@ -4598,15 +4590,7 @@
         <w:t>editorial</w:t>
       </w:r>
       <w:r>
-        <w:t xml:space="preserve"> - Cada libro tiene una única editorial. Relación </w:t>
-      </w:r>
-      <w:proofErr w:type="gramStart"/>
-      <w:r>
-        <w:t>1:N</w:t>
-      </w:r>
-      <w:proofErr w:type="gramEnd"/>
-      <w:r>
-        <w:t xml:space="preserve"> entre editorial y libro.</w:t>
+        <w:t xml:space="preserve"> - Cada libro tiene una única editorial. Relación 1:N entre editorial y libro.</w:t>
       </w:r>
     </w:p>
     <w:p>
@@ -4625,13 +4609,8 @@
         <w:t>autor</w:t>
       </w:r>
       <w:r>
-        <w:t xml:space="preserve"> - Un libro puede tener varios autores y un autor puede haber escrito varios libros. Relación </w:t>
-      </w:r>
-      <w:proofErr w:type="gramStart"/>
-      <w:r>
-        <w:t>N:M.</w:t>
-      </w:r>
-      <w:proofErr w:type="gramEnd"/>
+        <w:t xml:space="preserve"> - Un libro puede tener varios autores y un autor puede haber escrito varios libros. Relación N:M.</w:t>
+      </w:r>
     </w:p>
     <w:p>
       <w:pPr>
@@ -4651,13 +4630,8 @@
       </w:r>
       <w:proofErr w:type="spellEnd"/>
       <w:r>
-        <w:t xml:space="preserve"> - Un libro puede pertenecer a varias categorías. Relación </w:t>
-      </w:r>
-      <w:proofErr w:type="gramStart"/>
-      <w:r>
-        <w:t>N:M.</w:t>
-      </w:r>
-      <w:proofErr w:type="gramEnd"/>
+        <w:t xml:space="preserve"> - Un libro puede pertenecer a varias categorías. Relación N:M.</w:t>
+      </w:r>
     </w:p>
     <w:p>
       <w:pPr>
@@ -5145,15 +5119,7 @@
       </w:r>
       <w:proofErr w:type="gramEnd"/>
       <w:r>
-        <w:t xml:space="preserve"> del JSON se ignoran gracias a la anotación @</w:t>
-      </w:r>
-      <w:proofErr w:type="gramStart"/>
-      <w:r>
-        <w:t>JsonIgnoreProperties(</w:t>
-      </w:r>
-      <w:proofErr w:type="gramEnd"/>
-      <w:r>
-        <w:t>ignoreUnknown = true).</w:t>
+        <w:t xml:space="preserve"> del JSON se ignoran gracias a la anotación @JsonIgnoreProperties(ignoreUnknown = true).</w:t>
       </w:r>
     </w:p>
     <w:p>
@@ -5507,32 +5473,26 @@
         <w:t xml:space="preserve">, </w:t>
       </w:r>
       <w:proofErr w:type="spellStart"/>
-      <w:proofErr w:type="gramStart"/>
       <w:r>
         <w:t>th:each</w:t>
       </w:r>
       <w:proofErr w:type="spellEnd"/>
-      <w:proofErr w:type="gramEnd"/>
       <w:r>
         <w:t xml:space="preserve">, </w:t>
       </w:r>
       <w:proofErr w:type="spellStart"/>
-      <w:proofErr w:type="gramStart"/>
       <w:r>
         <w:t>th:if</w:t>
       </w:r>
       <w:proofErr w:type="spellEnd"/>
-      <w:proofErr w:type="gramEnd"/>
       <w:r>
         <w:t xml:space="preserve"> o </w:t>
       </w:r>
       <w:proofErr w:type="spellStart"/>
-      <w:proofErr w:type="gramStart"/>
       <w:r>
         <w:t>th:href</w:t>
       </w:r>
       <w:proofErr w:type="spellEnd"/>
-      <w:proofErr w:type="gramEnd"/>
       <w:r>
         <w:t>.</w:t>
       </w:r>
@@ -5631,25 +5591,14 @@
         <w:t xml:space="preserve"> - Vista de detalle de un libro individual. Se muestra al hacer clic sobre cualquier tarjeta de libro desde la página de inicio o la de búsqueda. Incluye toda la información disponible: portada en tamaño grande, título, autores, editorial, fecha de publicación, ISBN, categorías y sinopsis. En la parte superior aparece un banner que indica si el libro está en stock (verde) o no (rojo). </w:t>
       </w:r>
       <w:r>
-        <w:rPr>
-          <w:highlight w:val="yellow"/>
-        </w:rPr>
         <w:t xml:space="preserve">El botón "Volver" utiliza </w:t>
       </w:r>
       <w:proofErr w:type="spellStart"/>
-      <w:proofErr w:type="gramStart"/>
-      <w:r>
-        <w:rPr>
-          <w:highlight w:val="yellow"/>
-        </w:rPr>
+      <w:r>
         <w:t>history.back</w:t>
       </w:r>
       <w:proofErr w:type="spellEnd"/>
-      <w:proofErr w:type="gramEnd"/>
-      <w:r>
-        <w:rPr>
-          <w:highlight w:val="yellow"/>
-        </w:rPr>
+      <w:r>
         <w:t>() de JavaScript para regresar a la página anterior, preservando los parámetros de búsqueda si los hubiera</w:t>
       </w:r>
       <w:r>
@@ -6181,18 +6130,13 @@
       </w:r>
       <w:proofErr w:type="spellEnd"/>
       <w:r>
-        <w:t>(</w:t>
-      </w:r>
-      <w:proofErr w:type="gramStart"/>
-      <w:r>
-        <w:t>).</w:t>
+        <w:t>().</w:t>
       </w:r>
       <w:proofErr w:type="spellStart"/>
       <w:r>
         <w:t>thenReturn</w:t>
       </w:r>
       <w:proofErr w:type="spellEnd"/>
-      <w:proofErr w:type="gramEnd"/>
       <w:r>
         <w:t>(). Los casos cubiertos son:</w:t>
       </w:r>
@@ -20215,7 +20159,7 @@
       <w:pgMar w:top="1134" w:right="851" w:bottom="1134" w:left="993" w:header="709" w:footer="709" w:gutter="0"/>
       <w:cols w:space="720"/>
       <w:formProt w:val="0"/>
-      <w:docGrid w:linePitch="100"/>
+      <w:docGrid w:linePitch="245"/>
     </w:sectPr>
   </w:body>
 </w:document>
@@ -20505,6 +20449,69 @@
       <w:spacing w:after="0" w:line="276" w:lineRule="auto"/>
       <w:ind w:left="0" w:firstLine="0"/>
     </w:pPr>
+    <w:r>
+      <w:rPr>
+        <w:noProof/>
+      </w:rPr>
+      <w:drawing>
+        <wp:anchor distT="0" distB="0" distL="114300" distR="114300" simplePos="0" relativeHeight="251659264" behindDoc="0" locked="0" layoutInCell="1" allowOverlap="1" wp14:anchorId="07C65240" wp14:editId="11E58DCC">
+          <wp:simplePos x="0" y="0"/>
+          <wp:positionH relativeFrom="column">
+            <wp:posOffset>137160</wp:posOffset>
+          </wp:positionH>
+          <wp:positionV relativeFrom="paragraph">
+            <wp:posOffset>168910</wp:posOffset>
+          </wp:positionV>
+          <wp:extent cx="1029335" cy="427990"/>
+          <wp:effectExtent l="0" t="0" r="0" b="0"/>
+          <wp:wrapNone/>
+          <wp:docPr id="1" name="image1.png"/>
+          <wp:cNvGraphicFramePr>
+            <a:graphicFrameLocks xmlns:a="http://schemas.openxmlformats.org/drawingml/2006/main" noChangeAspect="1"/>
+          </wp:cNvGraphicFramePr>
+          <a:graphic xmlns:a="http://schemas.openxmlformats.org/drawingml/2006/main">
+            <a:graphicData uri="http://schemas.openxmlformats.org/drawingml/2006/picture">
+              <pic:pic xmlns:pic="http://schemas.openxmlformats.org/drawingml/2006/picture">
+                <pic:nvPicPr>
+                  <pic:cNvPr id="1" name="image1.png"/>
+                  <pic:cNvPicPr>
+                    <a:picLocks noChangeAspect="1" noChangeArrowheads="1"/>
+                  </pic:cNvPicPr>
+                </pic:nvPicPr>
+                <pic:blipFill>
+                  <a:blip r:embed="rId1">
+                    <a:extLst>
+                      <a:ext uri="{28A0092B-C50C-407E-A947-70E740481C1C}">
+                        <a14:useLocalDpi xmlns:a14="http://schemas.microsoft.com/office/drawing/2010/main" val="0"/>
+                      </a:ext>
+                    </a:extLst>
+                  </a:blip>
+                  <a:stretch>
+                    <a:fillRect/>
+                  </a:stretch>
+                </pic:blipFill>
+                <pic:spPr bwMode="auto">
+                  <a:xfrm>
+                    <a:off x="0" y="0"/>
+                    <a:ext cx="1029335" cy="427990"/>
+                  </a:xfrm>
+                  <a:prstGeom prst="rect">
+                    <a:avLst/>
+                  </a:prstGeom>
+                  <a:noFill/>
+                </pic:spPr>
+              </pic:pic>
+            </a:graphicData>
+          </a:graphic>
+          <wp14:sizeRelH relativeFrom="margin">
+            <wp14:pctWidth>0</wp14:pctWidth>
+          </wp14:sizeRelH>
+          <wp14:sizeRelV relativeFrom="margin">
+            <wp14:pctHeight>0</wp14:pctHeight>
+          </wp14:sizeRelV>
+        </wp:anchor>
+      </w:drawing>
+    </w:r>
   </w:p>
   <w:tbl>
     <w:tblPr>
@@ -20548,49 +20555,6 @@
             <w:spacing w:after="0"/>
             <w:ind w:left="0" w:firstLine="0"/>
           </w:pPr>
-          <w:r>
-            <w:rPr>
-              <w:noProof/>
-            </w:rPr>
-            <w:drawing>
-              <wp:inline distT="0" distB="0" distL="0" distR="0" wp14:anchorId="07C65240" wp14:editId="5E4E20DD">
-                <wp:extent cx="1029335" cy="427990"/>
-                <wp:effectExtent l="0" t="0" r="0" b="0"/>
-                <wp:docPr id="1" name="image1.png"/>
-                <wp:cNvGraphicFramePr>
-                  <a:graphicFrameLocks xmlns:a="http://schemas.openxmlformats.org/drawingml/2006/main" noChangeAspect="1"/>
-                </wp:cNvGraphicFramePr>
-                <a:graphic xmlns:a="http://schemas.openxmlformats.org/drawingml/2006/main">
-                  <a:graphicData uri="http://schemas.openxmlformats.org/drawingml/2006/picture">
-                    <pic:pic xmlns:pic="http://schemas.openxmlformats.org/drawingml/2006/picture">
-                      <pic:nvPicPr>
-                        <pic:cNvPr id="1" name="image1.png"/>
-                        <pic:cNvPicPr>
-                          <a:picLocks noChangeAspect="1" noChangeArrowheads="1"/>
-                        </pic:cNvPicPr>
-                      </pic:nvPicPr>
-                      <pic:blipFill>
-                        <a:blip r:embed="rId1"/>
-                        <a:stretch>
-                          <a:fillRect/>
-                        </a:stretch>
-                      </pic:blipFill>
-                      <pic:spPr bwMode="auto">
-                        <a:xfrm>
-                          <a:off x="0" y="0"/>
-                          <a:ext cx="1029335" cy="427990"/>
-                        </a:xfrm>
-                        <a:prstGeom prst="rect">
-                          <a:avLst/>
-                        </a:prstGeom>
-                        <a:noFill/>
-                      </pic:spPr>
-                    </pic:pic>
-                  </a:graphicData>
-                </a:graphic>
-              </wp:inline>
-            </w:drawing>
-          </w:r>
         </w:p>
       </w:tc>
       <w:tc>
@@ -20772,11 +20736,21 @@
           <w:r>
             <w:t xml:space="preserve"> | </w:t>
           </w:r>
-          <w:fldSimple w:instr=" NUMPAGES ">
-            <w:r>
-              <w:t>4</w:t>
-            </w:r>
-          </w:fldSimple>
+          <w:r>
+            <w:fldChar w:fldCharType="begin"/>
+          </w:r>
+          <w:r>
+            <w:instrText xml:space="preserve"> NUMPAGES </w:instrText>
+          </w:r>
+          <w:r>
+            <w:fldChar w:fldCharType="separate"/>
+          </w:r>
+          <w:r>
+            <w:t>4</w:t>
+          </w:r>
+          <w:r>
+            <w:fldChar w:fldCharType="end"/>
+          </w:r>
         </w:p>
       </w:tc>
     </w:tr>
@@ -21408,11 +21382,21 @@
           <w:r>
             <w:t xml:space="preserve"> | </w:t>
           </w:r>
-          <w:fldSimple w:instr=" NUMPAGES ">
-            <w:r>
-              <w:t>4</w:t>
-            </w:r>
-          </w:fldSimple>
+          <w:r>
+            <w:fldChar w:fldCharType="begin"/>
+          </w:r>
+          <w:r>
+            <w:instrText xml:space="preserve"> NUMPAGES </w:instrText>
+          </w:r>
+          <w:r>
+            <w:fldChar w:fldCharType="separate"/>
+          </w:r>
+          <w:r>
+            <w:t>4</w:t>
+          </w:r>
+          <w:r>
+            <w:fldChar w:fldCharType="end"/>
+          </w:r>
         </w:p>
       </w:tc>
     </w:tr>
@@ -21787,6 +21771,69 @@
       <w:spacing w:after="0" w:line="276" w:lineRule="auto"/>
       <w:ind w:left="0" w:firstLine="0"/>
     </w:pPr>
+    <w:r>
+      <w:rPr>
+        <w:noProof/>
+      </w:rPr>
+      <w:drawing>
+        <wp:anchor distT="0" distB="0" distL="114300" distR="114300" simplePos="0" relativeHeight="251658240" behindDoc="0" locked="0" layoutInCell="1" allowOverlap="1" wp14:anchorId="117DB429" wp14:editId="58B4EE29">
+          <wp:simplePos x="0" y="0"/>
+          <wp:positionH relativeFrom="column">
+            <wp:posOffset>169545</wp:posOffset>
+          </wp:positionH>
+          <wp:positionV relativeFrom="paragraph">
+            <wp:posOffset>159385</wp:posOffset>
+          </wp:positionV>
+          <wp:extent cx="1029335" cy="427990"/>
+          <wp:effectExtent l="0" t="0" r="0" b="0"/>
+          <wp:wrapNone/>
+          <wp:docPr id="1633307022" name="Imagen2"/>
+          <wp:cNvGraphicFramePr>
+            <a:graphicFrameLocks xmlns:a="http://schemas.openxmlformats.org/drawingml/2006/main" noChangeAspect="1"/>
+          </wp:cNvGraphicFramePr>
+          <a:graphic xmlns:a="http://schemas.openxmlformats.org/drawingml/2006/main">
+            <a:graphicData uri="http://schemas.openxmlformats.org/drawingml/2006/picture">
+              <pic:pic xmlns:pic="http://schemas.openxmlformats.org/drawingml/2006/picture">
+                <pic:nvPicPr>
+                  <pic:cNvPr id="3" name="Imagen2"/>
+                  <pic:cNvPicPr>
+                    <a:picLocks noChangeAspect="1" noChangeArrowheads="1"/>
+                  </pic:cNvPicPr>
+                </pic:nvPicPr>
+                <pic:blipFill>
+                  <a:blip r:embed="rId1">
+                    <a:extLst>
+                      <a:ext uri="{28A0092B-C50C-407E-A947-70E740481C1C}">
+                        <a14:useLocalDpi xmlns:a14="http://schemas.microsoft.com/office/drawing/2010/main" val="0"/>
+                      </a:ext>
+                    </a:extLst>
+                  </a:blip>
+                  <a:stretch>
+                    <a:fillRect/>
+                  </a:stretch>
+                </pic:blipFill>
+                <pic:spPr bwMode="auto">
+                  <a:xfrm>
+                    <a:off x="0" y="0"/>
+                    <a:ext cx="1029335" cy="427990"/>
+                  </a:xfrm>
+                  <a:prstGeom prst="rect">
+                    <a:avLst/>
+                  </a:prstGeom>
+                  <a:noFill/>
+                </pic:spPr>
+              </pic:pic>
+            </a:graphicData>
+          </a:graphic>
+          <wp14:sizeRelH relativeFrom="margin">
+            <wp14:pctWidth>0</wp14:pctWidth>
+          </wp14:sizeRelH>
+          <wp14:sizeRelV relativeFrom="margin">
+            <wp14:pctHeight>0</wp14:pctHeight>
+          </wp14:sizeRelV>
+        </wp:anchor>
+      </w:drawing>
+    </w:r>
   </w:p>
   <w:tbl>
     <w:tblPr>
@@ -21828,51 +21875,8 @@
               <w:tab w:val="right" w:pos="10800"/>
             </w:tabs>
             <w:spacing w:after="0"/>
-            <w:ind w:left="0" w:firstLine="0"/>
+            <w:ind w:left="-1224" w:firstLine="0"/>
           </w:pPr>
-          <w:r>
-            <w:rPr>
-              <w:noProof/>
-            </w:rPr>
-            <w:drawing>
-              <wp:inline distT="0" distB="0" distL="0" distR="0" wp14:anchorId="117DB429" wp14:editId="1E753A33">
-                <wp:extent cx="1029335" cy="427990"/>
-                <wp:effectExtent l="0" t="0" r="0" b="0"/>
-                <wp:docPr id="1633307022" name="Imagen2"/>
-                <wp:cNvGraphicFramePr>
-                  <a:graphicFrameLocks xmlns:a="http://schemas.openxmlformats.org/drawingml/2006/main" noChangeAspect="1"/>
-                </wp:cNvGraphicFramePr>
-                <a:graphic xmlns:a="http://schemas.openxmlformats.org/drawingml/2006/main">
-                  <a:graphicData uri="http://schemas.openxmlformats.org/drawingml/2006/picture">
-                    <pic:pic xmlns:pic="http://schemas.openxmlformats.org/drawingml/2006/picture">
-                      <pic:nvPicPr>
-                        <pic:cNvPr id="3" name="Imagen2"/>
-                        <pic:cNvPicPr>
-                          <a:picLocks noChangeAspect="1" noChangeArrowheads="1"/>
-                        </pic:cNvPicPr>
-                      </pic:nvPicPr>
-                      <pic:blipFill>
-                        <a:blip r:embed="rId1"/>
-                        <a:stretch>
-                          <a:fillRect/>
-                        </a:stretch>
-                      </pic:blipFill>
-                      <pic:spPr bwMode="auto">
-                        <a:xfrm>
-                          <a:off x="0" y="0"/>
-                          <a:ext cx="1029335" cy="427990"/>
-                        </a:xfrm>
-                        <a:prstGeom prst="rect">
-                          <a:avLst/>
-                        </a:prstGeom>
-                        <a:noFill/>
-                      </pic:spPr>
-                    </pic:pic>
-                  </a:graphicData>
-                </a:graphic>
-              </wp:inline>
-            </w:drawing>
-          </w:r>
         </w:p>
       </w:tc>
       <w:tc>

</xml_diff>